<commit_message>
njd motion-brief docx: soffice wrote no PDF because the filter's sections named footer relationships (rId9, rId10) the document lacks; now fb render's footers and multi-pass TOC/TOA page numbers (needles, FORMBOOK_FINAL), Times New Roman via docx/reference.xml, designations right in the caption, signature kept with the conclusion; check.sh --engine docx 8 passed 0 failed (fb-595.63)
</commit_message>
<xml_diff>
--- a/courts/third-circuit/new-jersey/federal/district/motion-brief/usage/OUTPUT-motion-brief.docx
+++ b/courts/third-circuit/new-jersey/federal/district/motion-brief/usage/OUTPUT-motion-brief.docx
@@ -446,8 +446,7 @@
           </w:p>
           <w:p>
             <w:pPr>
-              <w:pStyle w:val="Single"/>
-              <w:ind w:left="2592" w:firstLine="0"/>
+              <w:pStyle w:val="Designation"/>
             </w:pPr>
             <w:r>
               <w:t xml:space="preserve">Plaintiff,</w:t>
@@ -567,8 +566,7 @@
           </w:p>
           <w:p>
             <w:pPr>
-              <w:pStyle w:val="Single"/>
-              <w:ind w:left="2592" w:firstLine="0"/>
+              <w:pStyle w:val="Designation"/>
             </w:pPr>
             <w:r>
               <w:t xml:space="preserve">Defendants.</w:t>
@@ -870,7 +868,7 @@
     <w:p>
       <w:pPr>
         <w:sectPr>
-          <w:footerReference w:type="default" r:id="rId10"/>
+          <w:footerReference w:type="default" r:id="rIdFtrNone"/>
           <w:pgSz w:w="12240" w:h="15840"/>
           <w:pgMar w:top="1440" w:right="1440" w:bottom="1440" w:left="1440" w:header="720" w:footer="720" w:gutter="0"/>
         </w:sectPr>
@@ -886,20 +884,35 @@
     </w:p>
     <w:p>
       <w:pPr>
+        <w:pStyle w:val="Single"/>
+        <w:keepNext/>
+        <w:spacing w:before="0" w:after="200"/>
+        <w:jc w:val="right"/>
+      </w:pPr>
+      <w:r>
+        <w:rPr>
+          <w:b/>
+          <w:bCs/>
+        </w:rPr>
+        <w:t xml:space="preserve">Page</w:t>
+      </w:r>
+    </w:p>
+    <w:p>
+      <w:pPr>
         <w:pStyle w:val="TOCEntry"/>
       </w:pPr>
       <w:r>
-        <w:fldChar w:fldCharType="begin"/>
-      </w:r>
-      <w:r>
-        <w:instrText xml:space="preserve"> TOC \o "1-4" \h \z </w:instrText>
-      </w:r>
-      <w:r>
-        <w:fldChar w:fldCharType="separate"/>
-      </w:r>
-      <w:r>
         <w:t xml:space="preserve">INTRODUCTION</w:t>
       </w:r>
+      <w:r>
+        <w:t xml:space="preserve"> </w:t>
+      </w:r>
+      <w:r>
+        <w:tab/>
+      </w:r>
+      <w:r>
+        <w:t xml:space="preserve">1</w:t>
+      </w:r>
     </w:p>
     <w:p>
       <w:pPr>
@@ -908,6 +921,15 @@
       <w:r>
         <w:t xml:space="preserve">STATEMENT OF FACTS</w:t>
       </w:r>
+      <w:r>
+        <w:t xml:space="preserve"> </w:t>
+      </w:r>
+      <w:r>
+        <w:tab/>
+      </w:r>
+      <w:r>
+        <w:t xml:space="preserve">2</w:t>
+      </w:r>
     </w:p>
     <w:p>
       <w:pPr>
@@ -916,6 +938,15 @@
       <w:r>
         <w:t xml:space="preserve">LEGAL STANDARD</w:t>
       </w:r>
+      <w:r>
+        <w:t xml:space="preserve"> </w:t>
+      </w:r>
+      <w:r>
+        <w:tab/>
+      </w:r>
+      <w:r>
+        <w:t xml:space="preserve">3</w:t>
+      </w:r>
     </w:p>
     <w:p>
       <w:pPr>
@@ -924,11 +955,20 @@
       <w:r>
         <w:t xml:space="preserve">ARGUMENT</w:t>
       </w:r>
+      <w:r>
+        <w:t xml:space="preserve"> </w:t>
+      </w:r>
+      <w:r>
+        <w:tab/>
+      </w:r>
+      <w:r>
+        <w:t xml:space="preserve">4</w:t>
+      </w:r>
     </w:p>
     <w:p>
       <w:pPr>
         <w:pStyle w:val="TOCEntry"/>
-        <w:ind w:left="720" w:hanging="720" w:firstLine="0"/>
+        <w:ind w:left="720" w:right="720" w:hanging="720"/>
       </w:pPr>
       <w:r>
         <w:t xml:space="preserve">I.</w:t>
@@ -993,6 +1033,15 @@
       <w:r>
         <w:t xml:space="preserve">4A.</w:t>
       </w:r>
+      <w:r>
+        <w:t xml:space="preserve"> </w:t>
+      </w:r>
+      <w:r>
+        <w:tab/>
+      </w:r>
+      <w:r>
+        <w:t xml:space="preserve">4</w:t>
+      </w:r>
     </w:p>
     <w:p>
       <w:pPr>
@@ -1002,7 +1051,13 @@
         <w:t xml:space="preserve">CONCLUSION</w:t>
       </w:r>
       <w:r>
-        <w:fldChar w:fldCharType="end"/>
+        <w:t xml:space="preserve"> </w:t>
+      </w:r>
+      <w:r>
+        <w:tab/>
+      </w:r>
+      <w:r>
+        <w:t xml:space="preserve">8</w:t>
       </w:r>
     </w:p>
     <w:p>
@@ -1015,6 +1070,21 @@
     </w:p>
     <w:p>
       <w:pPr>
+        <w:pStyle w:val="Single"/>
+        <w:keepNext/>
+        <w:spacing w:before="0" w:after="200"/>
+        <w:jc w:val="right"/>
+      </w:pPr>
+      <w:r>
+        <w:rPr>
+          <w:b/>
+          <w:bCs/>
+        </w:rPr>
+        <w:t xml:space="preserve">Page(s)</w:t>
+      </w:r>
+    </w:p>
+    <w:p>
+      <w:pPr>
         <w:pStyle w:val="TOAGroup"/>
       </w:pPr>
       <w:r>
@@ -1140,6 +1210,15 @@
       <w:r>
         <w:t xml:space="preserve">(2014)</w:t>
       </w:r>
+      <w:r>
+        <w:t xml:space="preserve"> </w:t>
+      </w:r>
+      <w:r>
+        <w:tab/>
+      </w:r>
+      <w:r>
+        <w:t xml:space="preserve">5</w:t>
+      </w:r>
     </w:p>
     <w:p>
       <w:pPr>
@@ -1204,6 +1283,15 @@
       <w:r>
         <w:t xml:space="preserve">(2009)</w:t>
       </w:r>
+      <w:r>
+        <w:t xml:space="preserve"> </w:t>
+      </w:r>
+      <w:r>
+        <w:tab/>
+      </w:r>
+      <w:r>
+        <w:t xml:space="preserve">4</w:t>
+      </w:r>
     </w:p>
     <w:p>
       <w:pPr>
@@ -1378,6 +1466,15 @@
       <w:r>
         <w:t xml:space="preserve">1995)</w:t>
       </w:r>
+      <w:r>
+        <w:t xml:space="preserve"> </w:t>
+      </w:r>
+      <w:r>
+        <w:tab/>
+      </w:r>
+      <w:r>
+        <w:t xml:space="preserve">6</w:t>
+      </w:r>
     </w:p>
     <w:p>
       <w:pPr>
@@ -1456,6 +1553,15 @@
       <w:r>
         <w:t xml:space="preserve">(2007)</w:t>
       </w:r>
+      <w:r>
+        <w:t xml:space="preserve"> </w:t>
+      </w:r>
+      <w:r>
+        <w:tab/>
+      </w:r>
+      <w:r>
+        <w:t xml:space="preserve">4</w:t>
+      </w:r>
     </w:p>
     <w:p>
       <w:pPr>
@@ -1586,6 +1692,15 @@
       <w:r>
         <w:t xml:space="preserve">2020)</w:t>
       </w:r>
+      <w:r>
+        <w:t xml:space="preserve"> </w:t>
+      </w:r>
+      <w:r>
+        <w:tab/>
+      </w:r>
+      <w:r>
+        <w:t xml:space="preserve">6</w:t>
+      </w:r>
     </w:p>
     <w:p>
       <w:pPr>
@@ -1702,6 +1817,15 @@
       <w:r>
         <w:t xml:space="preserve">2018)</w:t>
       </w:r>
+      <w:r>
+        <w:t xml:space="preserve"> </w:t>
+      </w:r>
+      <w:r>
+        <w:tab/>
+      </w:r>
+      <w:r>
+        <w:t xml:space="preserve">5</w:t>
+      </w:r>
     </w:p>
     <w:p>
       <w:pPr>
@@ -1840,6 +1964,15 @@
       <w:r>
         <w:t xml:space="preserve">2007)</w:t>
       </w:r>
+      <w:r>
+        <w:t xml:space="preserve"> </w:t>
+      </w:r>
+      <w:r>
+        <w:tab/>
+      </w:r>
+      <w:r>
+        <w:t xml:space="preserve">6</w:t>
+      </w:r>
     </w:p>
     <w:p>
       <w:pPr>
@@ -1930,6 +2063,15 @@
       <w:r>
         <w:t xml:space="preserve">2009)</w:t>
       </w:r>
+      <w:r>
+        <w:t xml:space="preserve"> </w:t>
+      </w:r>
+      <w:r>
+        <w:tab/>
+      </w:r>
+      <w:r>
+        <w:t xml:space="preserve">3</w:t>
+      </w:r>
     </w:p>
     <w:p>
       <w:pPr>
@@ -2082,6 +2224,15 @@
       <w:r>
         <w:t xml:space="preserve">2022)</w:t>
       </w:r>
+      <w:r>
+        <w:t xml:space="preserve"> </w:t>
+      </w:r>
+      <w:r>
+        <w:tab/>
+      </w:r>
+      <w:r>
+        <w:t xml:space="preserve">5</w:t>
+      </w:r>
     </w:p>
     <w:p>
       <w:pPr>
@@ -2158,6 +2309,15 @@
       <w:r>
         <w:t xml:space="preserve">2013)</w:t>
       </w:r>
+      <w:r>
+        <w:t xml:space="preserve"> </w:t>
+      </w:r>
+      <w:r>
+        <w:tab/>
+      </w:r>
+      <w:r>
+        <w:t xml:space="preserve">4</w:t>
+      </w:r>
     </w:p>
     <w:p>
       <w:pPr>
@@ -2276,6 +2436,15 @@
       <w:r>
         <w:t xml:space="preserve">1997)</w:t>
       </w:r>
+      <w:r>
+        <w:t xml:space="preserve"> </w:t>
+      </w:r>
+      <w:r>
+        <w:tab/>
+      </w:r>
+      <w:r>
+        <w:t xml:space="preserve">4</w:t>
+      </w:r>
     </w:p>
     <w:p>
       <w:pPr>
@@ -2436,6 +2605,15 @@
       <w:r>
         <w:t xml:space="preserve">1982)</w:t>
       </w:r>
+      <w:r>
+        <w:t xml:space="preserve"> </w:t>
+      </w:r>
+      <w:r>
+        <w:tab/>
+      </w:r>
+      <w:r>
+        <w:t xml:space="preserve">6</w:t>
+      </w:r>
     </w:p>
     <w:p>
       <w:pPr>
@@ -2536,6 +2714,15 @@
       <w:r>
         <w:t xml:space="preserve">2018)</w:t>
       </w:r>
+      <w:r>
+        <w:t xml:space="preserve"> </w:t>
+      </w:r>
+      <w:r>
+        <w:tab/>
+      </w:r>
+      <w:r>
+        <w:t xml:space="preserve">3</w:t>
+      </w:r>
     </w:p>
     <w:p>
       <w:pPr>
@@ -2612,6 +2799,15 @@
       <w:r>
         <w:t xml:space="preserve">2017)</w:t>
       </w:r>
+      <w:r>
+        <w:t xml:space="preserve"> </w:t>
+      </w:r>
+      <w:r>
+        <w:tab/>
+      </w:r>
+      <w:r>
+        <w:t xml:space="preserve">4</w:t>
+      </w:r>
     </w:p>
     <w:p>
       <w:pPr>
@@ -2778,6 +2974,15 @@
       <w:r>
         <w:t xml:space="preserve">2007)</w:t>
       </w:r>
+      <w:r>
+        <w:t xml:space="preserve"> </w:t>
+      </w:r>
+      <w:r>
+        <w:tab/>
+      </w:r>
+      <w:r>
+        <w:t xml:space="preserve">6</w:t>
+      </w:r>
     </w:p>
     <w:p>
       <w:pPr>
@@ -2922,6 +3127,15 @@
       <w:r>
         <w:t xml:space="preserve">2020)</w:t>
       </w:r>
+      <w:r>
+        <w:t xml:space="preserve"> </w:t>
+      </w:r>
+      <w:r>
+        <w:tab/>
+      </w:r>
+      <w:r>
+        <w:t xml:space="preserve">5</w:t>
+      </w:r>
     </w:p>
     <w:p>
       <w:pPr>
@@ -3026,6 +3240,15 @@
       <w:r>
         <w:t xml:space="preserve">2010)</w:t>
       </w:r>
+      <w:r>
+        <w:t xml:space="preserve"> </w:t>
+      </w:r>
+      <w:r>
+        <w:tab/>
+      </w:r>
+      <w:r>
+        <w:t xml:space="preserve">4</w:t>
+      </w:r>
     </w:p>
     <w:p>
       <w:pPr>
@@ -3200,6 +3423,15 @@
       <w:r>
         <w:t xml:space="preserve">1983)</w:t>
       </w:r>
+      <w:r>
+        <w:t xml:space="preserve"> </w:t>
+      </w:r>
+      <w:r>
+        <w:tab/>
+      </w:r>
+      <w:r>
+        <w:t xml:space="preserve">5</w:t>
+      </w:r>
     </w:p>
     <w:p>
       <w:pPr>
@@ -3228,6 +3460,15 @@
       <w:r>
         <w:t xml:space="preserve">12A:1-103(b)</w:t>
       </w:r>
+      <w:r>
+        <w:t xml:space="preserve"> </w:t>
+      </w:r>
+      <w:r>
+        <w:tab/>
+      </w:r>
+      <w:r>
+        <w:t xml:space="preserve">5</w:t>
+      </w:r>
     </w:p>
     <w:p>
       <w:pPr>
@@ -3260,6 +3501,15 @@
       <w:r>
         <w:t xml:space="preserve">seq.</w:t>
       </w:r>
+      <w:r>
+        <w:t xml:space="preserve"> </w:t>
+      </w:r>
+      <w:r>
+        <w:tab/>
+      </w:r>
+      <w:r>
+        <w:t xml:space="preserve">1, 4</w:t>
+      </w:r>
     </w:p>
     <w:p>
       <w:pPr>
@@ -3280,6 +3530,15 @@
       <w:r>
         <w:t xml:space="preserve">12A:4A-209</w:t>
       </w:r>
+      <w:r>
+        <w:t xml:space="preserve"> </w:t>
+      </w:r>
+      <w:r>
+        <w:tab/>
+      </w:r>
+      <w:r>
+        <w:t xml:space="preserve">7</w:t>
+      </w:r>
     </w:p>
     <w:p>
       <w:pPr>
@@ -3300,6 +3559,15 @@
       <w:r>
         <w:t xml:space="preserve">12A:4A-402</w:t>
       </w:r>
+      <w:r>
+        <w:t xml:space="preserve"> </w:t>
+      </w:r>
+      <w:r>
+        <w:tab/>
+      </w:r>
+      <w:r>
+        <w:t xml:space="preserve">7</w:t>
+      </w:r>
     </w:p>
     <w:p>
       <w:pPr>
@@ -3320,6 +3588,15 @@
       <w:r>
         <w:t xml:space="preserve">12A:4A-404</w:t>
       </w:r>
+      <w:r>
+        <w:t xml:space="preserve"> </w:t>
+      </w:r>
+      <w:r>
+        <w:tab/>
+      </w:r>
+      <w:r>
+        <w:t xml:space="preserve">6</w:t>
+      </w:r>
     </w:p>
     <w:p>
       <w:pPr>
@@ -3340,6 +3617,15 @@
       <w:r>
         <w:t xml:space="preserve">17:9A-223</w:t>
       </w:r>
+      <w:r>
+        <w:t xml:space="preserve"> </w:t>
+      </w:r>
+      <w:r>
+        <w:tab/>
+      </w:r>
+      <w:r>
+        <w:t xml:space="preserve">1</w:t>
+      </w:r>
     </w:p>
     <w:p>
       <w:pPr>
@@ -3380,25 +3666,35 @@
       <w:r>
         <w:t xml:space="preserve">12(b)(6)</w:t>
       </w:r>
+      <w:r>
+        <w:t xml:space="preserve"> </w:t>
+      </w:r>
+      <w:r>
+        <w:tab/>
+      </w:r>
+      <w:r>
+        <w:t xml:space="preserve">1, 2, 3, 8</w:t>
+      </w:r>
     </w:p>
     <w:p>
       <w:pPr>
         <w:sectPr>
-          <w:footerReference w:type="default" r:id="rId9"/>
+          <w:footerReference w:type="default" r:id="rIdFtrPage"/>
           <w:pgSz w:w="12240" w:h="15840"/>
           <w:pgMar w:top="1440" w:right="1440" w:bottom="1440" w:left="1440" w:header="720" w:footer="720" w:gutter="0"/>
           <w:pgNumType w:fmt="lowerRoman" w:start="1"/>
         </w:sectPr>
       </w:pPr>
     </w:p>
-    <w:bookmarkStart w:id="20" w:name="introduction"/>
     <w:p>
       <w:pPr>
         <w:pStyle w:val="Heading1"/>
       </w:pPr>
+      <w:bookmarkStart w:id="9" w:name="_introduction"/>
       <w:r>
         <w:t xml:space="preserve">Introduction</w:t>
       </w:r>
+      <w:bookmarkEnd w:id="9"/>
     </w:p>
     <w:p>
       <w:pPr>
@@ -3444,15 +3740,15 @@
         <w:t xml:space="preserve">For these reasons and as explained below, Plaintiff’s Complaint should be dismissed under Fed. R. Civ. P. 12(b)(6).</w:t>
       </w:r>
     </w:p>
-    <w:bookmarkEnd w:id="20"/>
-    <w:bookmarkStart w:id="21" w:name="statement-of-facts"/>
     <w:p>
       <w:pPr>
         <w:pStyle w:val="Heading1"/>
       </w:pPr>
+      <w:bookmarkStart w:id="10" w:name="_c782d4980352688b0148305281d62652acab74d"/>
       <w:r>
         <w:t xml:space="preserve">Statement of Facts</w:t>
       </w:r>
+      <w:bookmarkEnd w:id="10"/>
     </w:p>
     <w:p>
       <w:pPr>
@@ -3612,15 +3908,15 @@
         <w:t xml:space="preserve">Compl. ¶¶ 35–50.</w:t>
       </w:r>
     </w:p>
-    <w:bookmarkEnd w:id="21"/>
-    <w:bookmarkStart w:id="22" w:name="legal-standard"/>
     <w:p>
       <w:pPr>
         <w:pStyle w:val="Heading1"/>
       </w:pPr>
+      <w:bookmarkStart w:id="11" w:name="_f71bb8ee81b7f5e1fea0089ad4ffa65b0be4956"/>
       <w:r>
         <w:t xml:space="preserve">Legal Standard</w:t>
       </w:r>
+      <w:bookmarkEnd w:id="11"/>
     </w:p>
     <w:p>
       <w:pPr>
@@ -3815,21 +4111,21 @@
         <w:t xml:space="preserve">, 609 F.3d 239, 263 n.27 (3d Cir. 2010).</w:t>
       </w:r>
     </w:p>
-    <w:bookmarkEnd w:id="22"/>
-    <w:bookmarkStart w:id="24" w:name="argument"/>
     <w:p>
       <w:pPr>
         <w:pStyle w:val="Heading1"/>
       </w:pPr>
+      <w:bookmarkStart w:id="12" w:name="_argument"/>
       <w:r>
         <w:t xml:space="preserve">Argument</w:t>
       </w:r>
-    </w:p>
-    <w:bookmarkStart w:id="23" w:name="X077b75ebe734e6bb586f5b59793faba58303ee7"/>
+      <w:bookmarkEnd w:id="12"/>
+    </w:p>
     <w:p>
       <w:pPr>
         <w:pStyle w:val="Heading2"/>
       </w:pPr>
+      <w:bookmarkStart w:id="13" w:name="_077b75ebe734e6bb586f5b59793faba58303ee7"/>
       <w:r>
         <w:t xml:space="preserve">I.</w:t>
       </w:r>
@@ -3839,6 +4135,7 @@
       <w:r>
         <w:t xml:space="preserve">Plaintiff’s Common Law Claims Are Preempted by UCC Article 4A.</w:t>
       </w:r>
+      <w:bookmarkEnd w:id="13"/>
     </w:p>
     <w:p>
       <w:pPr>
@@ -4219,20 +4516,19 @@
         <w:t xml:space="preserve">[Remainder of Point I, Points II through IV, and their citations are omitted from this transcription.]</w:t>
       </w:r>
     </w:p>
-    <w:bookmarkEnd w:id="23"/>
-    <w:bookmarkEnd w:id="24"/>
-    <w:bookmarkStart w:id="25" w:name="conclusion"/>
     <w:p>
       <w:pPr>
         <w:pStyle w:val="Heading1"/>
       </w:pPr>
+      <w:bookmarkStart w:id="14" w:name="_conclusion"/>
       <w:r>
         <w:t xml:space="preserve">Conclusion</w:t>
       </w:r>
-    </w:p>
-    <w:p>
-      <w:pPr>
-        <w:pStyle w:val="FirstParagraph"/>
+      <w:bookmarkEnd w:id="14"/>
+    </w:p>
+    <w:p>
+      <w:pPr>
+        <w:pStyle w:val="BodyKeep"/>
       </w:pPr>
       <w:r>
         <w:t xml:space="preserve">For the foregoing reasons, BANA requests that the Court grant its Motion to Dismiss Plaintiff’s Complaint in its entirety with prejudice pursuant to Fed. R. Civ. P. 12(b)(6), and grant such other and further relief as the Court deems just and proper.</w:t>
@@ -4241,6 +4537,7 @@
     <w:p>
       <w:pPr>
         <w:pStyle w:val="Gap"/>
+        <w:keepNext/>
       </w:pPr>
     </w:p>
     <w:tbl>
@@ -4587,11 +4884,10 @@
         </w:tc>
       </w:tr>
     </w:tbl>
-    <w:bookmarkEnd w:id="25"/>
     <w:sectPr>
-      <w:footerReference r:id="rId9" w:type="default"/>
-      <w:pgSz w:h="15840" w:w="12240"/>
-      <w:pgMar w:bottom="1440" w:footer="720" w:gutter="0" w:header="720" w:left="1440" w:right="1440" w:top="1440"/>
+      <w:footerReference w:type="default" r:id="rIdFtrPage"/>
+      <w:pgSz w:w="12240" w:h="15840"/>
+      <w:pgMar w:top="1440" w:right="1440" w:bottom="1440" w:left="1440" w:header="720" w:footer="720" w:gutter="0"/>
       <w:pgNumType w:fmt="decimal" w:start="1"/>
     </w:sectPr>
   </w:body>
@@ -4602,11 +4898,71 @@
 <w:comments xmlns:w="http://schemas.openxmlformats.org/wordprocessingml/2006/main" xmlns:m="http://schemas.openxmlformats.org/officeDocument/2006/math" xmlns:r="http://schemas.openxmlformats.org/officeDocument/2006/relationships" xmlns:o="urn:schemas-microsoft-com:office:office" xmlns:v="urn:schemas-microsoft-com:vml" xmlns:w10="urn:schemas-microsoft-com:office:word" xmlns:a="http://schemas.openxmlformats.org/drawingml/2006/main" xmlns:pic="http://schemas.openxmlformats.org/drawingml/2006/picture" xmlns:wp="http://schemas.openxmlformats.org/drawingml/2006/wordprocessingDrawing"/>
 </file>
 
-<file path=word/footer1.xml><?xml version="1.0" encoding="utf-8"?>
+<file path=word/footnotes.xml><?xml version="1.0" encoding="utf-8"?>
+<w:footnotes xmlns:w="http://schemas.openxmlformats.org/wordprocessingml/2006/main" xmlns:m="http://schemas.openxmlformats.org/officeDocument/2006/math" xmlns:r="http://schemas.openxmlformats.org/officeDocument/2006/relationships" xmlns:o="urn:schemas-microsoft-com:office:office" xmlns:v="urn:schemas-microsoft-com:vml" xmlns:w10="urn:schemas-microsoft-com:office:word" xmlns:a="http://schemas.openxmlformats.org/drawingml/2006/main" xmlns:pic="http://schemas.openxmlformats.org/drawingml/2006/picture" xmlns:wp="http://schemas.openxmlformats.org/drawingml/2006/wordprocessingDrawing">
+  <w:footnote w:type="continuationSeparator" w:id="0">
+    <w:p>
+      <w:r>
+        <w:continuationSeparator/>
+      </w:r>
+    </w:p>
+  </w:footnote>
+  <w:footnote w:type="separator" w:id="-1">
+    <w:p>
+      <w:r>
+        <w:separator/>
+      </w:r>
+    </w:p>
+  </w:footnote>
+</w:footnotes>
+</file>
+
+<file path=word/ftr-add.xml><?xml version="1.0" encoding="utf-8"?>
 <w:ftr xmlns:w="http://schemas.openxmlformats.org/wordprocessingml/2006/main" xmlns:r="http://schemas.openxmlformats.org/officeDocument/2006/relationships">
   <w:p>
     <w:pPr>
-      <w:pStyle w:val="Footer"/>
+      <w:spacing w:before="0" w:after="0"/>
+      <w:jc w:val="center"/>
+    </w:pPr>
+    <w:r>
+      <w:t>Add-</w:t>
+    </w:r>
+    <w:r>
+      <w:fldChar w:fldCharType="begin"/>
+    </w:r>
+    <w:r>
+      <w:instrText xml:space="preserve"> PAGE </w:instrText>
+    </w:r>
+    <w:r>
+      <w:fldChar w:fldCharType="separate"/>
+    </w:r>
+    <w:r>
+      <w:t>1</w:t>
+    </w:r>
+    <w:r>
+      <w:fldChar w:fldCharType="end"/>
+    </w:r>
+  </w:p>
+</w:ftr>
+</file>
+
+<file path=word/ftr-none.xml><?xml version="1.0" encoding="utf-8"?>
+<w:ftr xmlns:w="http://schemas.openxmlformats.org/wordprocessingml/2006/main" xmlns:r="http://schemas.openxmlformats.org/officeDocument/2006/relationships">
+  <w:p>
+    <w:pPr>
+      <w:spacing w:before="0" w:after="0"/>
+      <w:jc w:val="center"/>
+    </w:pPr>
+  </w:p>
+</w:ftr>
+</file>
+
+<file path=word/ftr-page.xml><?xml version="1.0" encoding="utf-8"?>
+<w:ftr xmlns:w="http://schemas.openxmlformats.org/wordprocessingml/2006/main" xmlns:r="http://schemas.openxmlformats.org/officeDocument/2006/relationships">
+  <w:p>
+    <w:pPr>
+      <w:spacing w:before="0" w:after="0"/>
+      <w:jc w:val="center"/>
     </w:pPr>
     <w:r>
       <w:fldChar w:fldCharType="begin"/>
@@ -4627,35 +4983,6 @@
 </w:ftr>
 </file>
 
-<file path=word/footer2.xml><?xml version="1.0" encoding="utf-8"?>
-<w:ftr xmlns:w="http://schemas.openxmlformats.org/wordprocessingml/2006/main" xmlns:r="http://schemas.openxmlformats.org/officeDocument/2006/relationships">
-  <w:p>
-    <w:pPr>
-      <w:pStyle w:val="Footer"/>
-    </w:pPr>
-  </w:p>
-</w:ftr>
-</file>
-
-<file path=word/footnotes.xml><?xml version="1.0" encoding="utf-8"?>
-<w:footnotes xmlns:w="http://schemas.openxmlformats.org/wordprocessingml/2006/main" xmlns:m="http://schemas.openxmlformats.org/officeDocument/2006/math" xmlns:r="http://schemas.openxmlformats.org/officeDocument/2006/relationships" xmlns:o="urn:schemas-microsoft-com:office:office" xmlns:v="urn:schemas-microsoft-com:vml" xmlns:w10="urn:schemas-microsoft-com:office:word" xmlns:a="http://schemas.openxmlformats.org/drawingml/2006/main" xmlns:pic="http://schemas.openxmlformats.org/drawingml/2006/picture" xmlns:wp="http://schemas.openxmlformats.org/drawingml/2006/wordprocessingDrawing">
-  <w:footnote w:type="continuationSeparator" w:id="0">
-    <w:p>
-      <w:r>
-        <w:continuationSeparator/>
-      </w:r>
-    </w:p>
-  </w:footnote>
-  <w:footnote w:type="separator" w:id="-1">
-    <w:p>
-      <w:r>
-        <w:separator/>
-      </w:r>
-    </w:p>
-  </w:footnote>
-</w:footnotes>
-</file>
-
 <file path=word/numbering.xml><?xml version="1.0" encoding="utf-8"?>
 <w:numbering xmlns:w="http://schemas.openxmlformats.org/wordprocessingml/2006/main">
   <w:abstractNum w:abstractNumId="990">
@@ -4745,63 +5072,20 @@
   <w:docDefaults>
     <w:rPrDefault>
       <w:rPr>
-        <w:rFonts w:ascii="Liberation Serif" w:cs="Liberation Serif" w:eastAsia="Liberation Serif" w:hAnsi="Liberation Serif"/>
+        <w:rFonts w:ascii="Times New Roman" w:hAnsi="Times New Roman" w:eastAsia="Times New Roman" w:cs="Times New Roman"/>
         <w:sz w:val="28"/>
         <w:szCs w:val="28"/>
-        <w:lang w:bidi="ar-SA" w:eastAsia="en-US" w:val="en-US"/>
+        <w:lang w:val="en-US" w:eastAsia="en-US" w:bidi="ar-SA"/>
       </w:rPr>
     </w:rPrDefault>
     <w:pPrDefault>
       <w:pPr>
-        <w:spacing w:after="0" w:before="0" w:line="240" w:lineRule="auto"/>
+        <w:spacing w:before="0" w:after="0" w:line="240" w:lineRule="auto"/>
       </w:pPr>
     </w:pPrDefault>
   </w:docDefaults>
-  <w:latentStyles w:count="276" w:defLockedState="0" w:defQFormat="0" w:defSemiHidden="0" w:defUIPriority="0" w:defUnhideWhenUsed="0"/>
-  <w:style w:default="1" w:styleId="Normal" w:type="paragraph">
-    <w:name w:val="Normal"/>
-    <w:qFormat/>
-    <w:pPr>
-      <w:widowControl/>
-      <w:spacing w:after="0" w:before="0" w:line="240" w:lineRule="auto"/>
-      <w:ind w:firstLine="0"/>
-    </w:pPr>
-    <w:rPr>
-      <w:rFonts w:ascii="Liberation Serif" w:cs="Liberation Serif" w:eastAsia="Liberation Serif" w:hAnsi="Liberation Serif"/>
-      <w:color w:val="000000"/>
-      <w:sz w:val="28"/>
-      <w:szCs w:val="28"/>
-    </w:rPr>
-  </w:style>
-  <w:style w:styleId="BodyText" w:type="paragraph">
-    <w:name w:val="Body Text"/>
-    <w:basedOn w:val="Normal"/>
-    <w:qFormat/>
-    <w:pPr>
-      <w:spacing w:after="0" w:before="0" w:line="566" w:lineRule="exact"/>
-      <w:ind w:firstLine="720"/>
-    </w:pPr>
-  </w:style>
-  <w:style w:styleId="FirstParagraph" w:type="paragraph">
-    <w:name w:val="First Paragraph"/>
-    <w:basedOn w:val="BodyText"/>
-    <w:next w:val="BodyText"/>
-    <w:qFormat/>
-    <w:pPr>
-      <w:spacing w:after="0" w:before="0" w:line="566" w:lineRule="exact"/>
-      <w:ind w:firstLine="720"/>
-    </w:pPr>
-  </w:style>
-  <w:style w:styleId="Compact" w:type="paragraph">
-    <w:name w:val="Compact"/>
-    <w:basedOn w:val="BodyText"/>
-    <w:qFormat/>
-    <w:pPr>
-      <w:spacing w:after="0" w:before="0" w:line="566" w:lineRule="exact"/>
-      <w:ind w:firstLine="0"/>
-    </w:pPr>
-  </w:style>
-  <w:style w:styleId="Title" w:type="paragraph">
+  <w:latentStyles w:defLockedState="0" w:defUIPriority="0" w:defSemiHidden="0" w:defUnhideWhenUsed="0" w:defQFormat="0" w:count="276"/>
+  <w:style w:type="paragraph" w:styleId="Title">
     <w:name w:val="Title"/>
     <w:basedOn w:val="Normal"/>
     <w:next w:val="BodyText"/>
@@ -4815,24 +5099,24 @@
       <w:jc w:val="center"/>
     </w:pPr>
     <w:rPr>
-      <w:rFonts w:asciiTheme="majorHAnsi" w:cstheme="majorBidi" w:eastAsiaTheme="majorEastAsia" w:hAnsiTheme="majorHAnsi"/>
+      <w:rFonts w:asciiTheme="majorHAnsi" w:eastAsiaTheme="majorEastAsia" w:hAnsiTheme="majorHAnsi" w:cstheme="majorBidi"/>
       <w:sz w:val="56"/>
       <w:szCs w:val="56"/>
     </w:rPr>
   </w:style>
-  <w:style w:customStyle="1" w:styleId="TitleChar" w:type="character">
+  <w:style w:type="character" w:customStyle="1" w:styleId="TitleChar">
     <w:name w:val="Title Char"/>
     <w:basedOn w:val="DefaultParagraphFont"/>
     <w:link w:val="Title"/>
     <w:uiPriority w:val="10"/>
     <w:rsid w:val="00A10FD9"/>
     <w:rPr>
-      <w:rFonts w:asciiTheme="majorHAnsi" w:cstheme="majorBidi" w:eastAsiaTheme="majorEastAsia" w:hAnsiTheme="majorHAnsi"/>
+      <w:rFonts w:asciiTheme="majorHAnsi" w:eastAsiaTheme="majorEastAsia" w:hAnsiTheme="majorHAnsi" w:cstheme="majorBidi"/>
       <w:sz w:val="56"/>
       <w:szCs w:val="56"/>
     </w:rPr>
   </w:style>
-  <w:style w:styleId="Subtitle" w:type="paragraph">
+  <w:style w:type="paragraph" w:styleId="Subtitle">
     <w:name w:val="Subtitle"/>
     <w:basedOn w:val="Title"/>
     <w:next w:val="BodyText"/>
@@ -4846,27 +5130,27 @@
       </w:numPr>
     </w:pPr>
     <w:rPr>
-      <w:rFonts w:cstheme="majorBidi" w:eastAsiaTheme="majorEastAsia"/>
+      <w:rFonts w:eastAsiaTheme="majorEastAsia" w:cstheme="majorBidi"/>
       <w:spacing w:val="15"/>
       <w:sz w:val="28"/>
       <w:szCs w:val="28"/>
     </w:rPr>
   </w:style>
-  <w:style w:customStyle="1" w:styleId="SubtitleChar" w:type="character">
+  <w:style w:type="character" w:customStyle="1" w:styleId="SubtitleChar">
     <w:name w:val="Subtitle Char"/>
     <w:basedOn w:val="DefaultParagraphFont"/>
     <w:link w:val="Subtitle"/>
     <w:uiPriority w:val="11"/>
     <w:rsid w:val="00A10FD9"/>
     <w:rPr>
-      <w:rFonts w:cstheme="majorBidi" w:eastAsiaTheme="majorEastAsia"/>
-      <w:color w:themeColor="text1" w:themeTint="A6" w:val="595959"/>
+      <w:rFonts w:eastAsiaTheme="majorEastAsia" w:cstheme="majorBidi"/>
+      <w:color w:val="595959" w:themeColor="text1" w:themeTint="A6"/>
       <w:spacing w:val="15"/>
       <w:sz w:val="28"/>
       <w:szCs w:val="28"/>
     </w:rPr>
   </w:style>
-  <w:style w:customStyle="1" w:styleId="Author" w:type="paragraph">
+  <w:style w:type="paragraph" w:customStyle="1" w:styleId="Author">
     <w:name w:val="Author"/>
     <w:basedOn w:val="Title"/>
     <w:next w:val="BodyText"/>
@@ -4880,7 +5164,7 @@
       <w:szCs w:val="24"/>
     </w:rPr>
   </w:style>
-  <w:style w:styleId="Date" w:type="paragraph">
+  <w:style w:type="paragraph" w:styleId="Date">
     <w:name w:val="Date"/>
     <w:basedOn w:val="Title"/>
     <w:next w:val="BodyText"/>
@@ -4894,7 +5178,7 @@
       <w:szCs w:val="24"/>
     </w:rPr>
   </w:style>
-  <w:style w:customStyle="1" w:styleId="AbstractTitle" w:type="paragraph">
+  <w:style w:type="paragraph" w:customStyle="1" w:styleId="AbstractTitle">
     <w:name w:val="Abstract Title"/>
     <w:basedOn w:val="Normal"/>
     <w:next w:val="Abstract"/>
@@ -4902,7 +5186,7 @@
     <w:pPr>
       <w:keepNext/>
       <w:keepLines/>
-      <w:spacing w:after="0" w:before="300"/>
+      <w:spacing w:before="300" w:after="0"/>
       <w:jc w:val="center"/>
     </w:pPr>
     <w:rPr>
@@ -4911,7 +5195,7 @@
       <w:szCs w:val="20"/>
     </w:rPr>
   </w:style>
-  <w:style w:customStyle="1" w:styleId="Abstract" w:type="paragraph">
+  <w:style w:type="paragraph" w:customStyle="1" w:styleId="Abstract">
     <w:name w:val="Abstract"/>
     <w:basedOn w:val="Normal"/>
     <w:next w:val="BodyText"/>
@@ -4919,14 +5203,14 @@
     <w:pPr>
       <w:keepNext/>
       <w:keepLines/>
-      <w:spacing w:after="300" w:before="100"/>
+      <w:spacing w:before="100" w:after="300"/>
     </w:pPr>
     <w:rPr>
       <w:sz w:val="20"/>
       <w:szCs w:val="20"/>
     </w:rPr>
   </w:style>
-  <w:style w:styleId="Bibliography" w:type="paragraph">
+  <w:style w:type="paragraph" w:styleId="Bibliography">
     <w:name w:val="Bibliography"/>
     <w:basedOn w:val="Normal"/>
     <w:next w:val="Bibliography"/>
@@ -4934,108 +5218,7 @@
     <w:pPr/>
     <w:rPr/>
   </w:style>
-  <w:style w:styleId="Heading1" w:type="paragraph">
-    <w:name w:val="heading 1"/>
-    <w:basedOn w:val="Normal"/>
-    <w:next w:val="BodyText"/>
-    <w:uiPriority w:val="9"/>
-    <w:qFormat/>
-    <w:pPr>
-      <w:keepNext/>
-      <w:keepLines/>
-      <w:spacing w:after="283" w:before="283" w:line="566" w:lineRule="exact"/>
-      <w:ind w:firstLine="0"/>
-      <w:jc w:val="center"/>
-      <w:outlineLvl w:val="0"/>
-    </w:pPr>
-    <w:rPr>
-      <w:b/>
-      <w:bCs/>
-      <w:caps/>
-      <w:color w:val="000000"/>
-      <w:sz w:val="28"/>
-      <w:szCs w:val="28"/>
-    </w:rPr>
-  </w:style>
-  <w:style w:styleId="Heading2" w:type="paragraph">
-    <w:name w:val="heading 2"/>
-    <w:basedOn w:val="Normal"/>
-    <w:next w:val="BodyText"/>
-    <w:uiPriority w:val="9"/>
-    <w:unhideWhenUsed/>
-    <w:qFormat/>
-    <w:pPr>
-      <w:keepNext/>
-      <w:keepLines/>
-      <w:tabs>
-        <w:tab w:pos="720" w:val="left"/>
-      </w:tabs>
-      <w:spacing w:after="283" w:before="283" w:line="566" w:lineRule="exact"/>
-      <w:ind w:firstLine="0" w:hanging="720" w:left="720"/>
-      <w:jc w:val="left"/>
-      <w:outlineLvl w:val="1"/>
-    </w:pPr>
-    <w:rPr>
-      <w:b/>
-      <w:bCs/>
-      <w:color w:val="000000"/>
-      <w:sz w:val="28"/>
-      <w:szCs w:val="28"/>
-    </w:rPr>
-  </w:style>
-  <w:style w:styleId="Heading3" w:type="paragraph">
-    <w:name w:val="heading 3"/>
-    <w:basedOn w:val="Normal"/>
-    <w:next w:val="BodyText"/>
-    <w:uiPriority w:val="9"/>
-    <w:unhideWhenUsed/>
-    <w:qFormat/>
-    <w:pPr>
-      <w:keepNext/>
-      <w:keepLines/>
-      <w:tabs>
-        <w:tab w:pos="1440" w:val="left"/>
-      </w:tabs>
-      <w:spacing w:after="283" w:before="283" w:line="566" w:lineRule="exact"/>
-      <w:ind w:firstLine="0" w:hanging="720" w:left="1440"/>
-      <w:jc w:val="left"/>
-      <w:outlineLvl w:val="2"/>
-    </w:pPr>
-    <w:rPr>
-      <w:b/>
-      <w:bCs/>
-      <w:color w:val="000000"/>
-      <w:sz w:val="28"/>
-      <w:szCs w:val="28"/>
-    </w:rPr>
-  </w:style>
-  <w:style w:styleId="Heading4" w:type="paragraph">
-    <w:name w:val="heading 4"/>
-    <w:basedOn w:val="Normal"/>
-    <w:next w:val="BodyText"/>
-    <w:uiPriority w:val="9"/>
-    <w:unhideWhenUsed/>
-    <w:qFormat/>
-    <w:pPr>
-      <w:keepNext/>
-      <w:keepLines/>
-      <w:tabs>
-        <w:tab w:pos="2160" w:val="left"/>
-      </w:tabs>
-      <w:spacing w:after="283" w:before="283" w:line="566" w:lineRule="exact"/>
-      <w:ind w:firstLine="0" w:hanging="720" w:left="2160"/>
-      <w:jc w:val="left"/>
-      <w:outlineLvl w:val="3"/>
-    </w:pPr>
-    <w:rPr>
-      <w:b/>
-      <w:bCs/>
-      <w:color w:val="000000"/>
-      <w:sz w:val="28"/>
-      <w:szCs w:val="28"/>
-    </w:rPr>
-  </w:style>
-  <w:style w:styleId="Heading5" w:type="paragraph">
+  <w:style w:type="paragraph" w:styleId="Heading5">
     <w:name w:val="heading 5"/>
     <w:basedOn w:val="Normal"/>
     <w:next w:val="BodyText"/>
@@ -5048,15 +5231,15 @@
     <w:pPr>
       <w:keepNext/>
       <w:keepLines/>
-      <w:spacing w:after="40" w:before="80"/>
+      <w:spacing w:before="80" w:after="40"/>
       <w:outlineLvl w:val="4"/>
     </w:pPr>
     <w:rPr>
-      <w:rFonts w:cstheme="majorBidi" w:eastAsiaTheme="majorEastAsia"/>
-      <w:color w:themeColor="accent1" w:themeShade="BF" w:val="0F4761"/>
+      <w:rFonts w:eastAsiaTheme="majorEastAsia" w:cstheme="majorBidi"/>
+      <w:color w:val="0F4761" w:themeColor="accent1" w:themeShade="BF"/>
     </w:rPr>
   </w:style>
-  <w:style w:styleId="Heading6" w:type="paragraph">
+  <w:style w:type="paragraph" w:styleId="Heading6">
     <w:name w:val="heading 6"/>
     <w:basedOn w:val="Normal"/>
     <w:next w:val="BodyText"/>
@@ -5069,17 +5252,17 @@
     <w:pPr>
       <w:keepNext/>
       <w:keepLines/>
-      <w:spacing w:after="0" w:before="40"/>
+      <w:spacing w:before="40" w:after="0"/>
       <w:outlineLvl w:val="5"/>
     </w:pPr>
     <w:rPr>
-      <w:rFonts w:cstheme="majorBidi" w:eastAsiaTheme="majorEastAsia"/>
+      <w:rFonts w:eastAsiaTheme="majorEastAsia" w:cstheme="majorBidi"/>
       <w:i/>
       <w:iCs/>
-      <w:color w:themeColor="text1" w:themeTint="A6" w:val="595959"/>
+      <w:color w:val="595959" w:themeColor="text1" w:themeTint="A6"/>
     </w:rPr>
   </w:style>
-  <w:style w:styleId="Heading7" w:type="paragraph">
+  <w:style w:type="paragraph" w:styleId="Heading7">
     <w:name w:val="heading 7"/>
     <w:basedOn w:val="Normal"/>
     <w:next w:val="BodyText"/>
@@ -5092,15 +5275,15 @@
     <w:pPr>
       <w:keepNext/>
       <w:keepLines/>
-      <w:spacing w:after="0" w:before="40"/>
+      <w:spacing w:before="40" w:after="0"/>
       <w:outlineLvl w:val="6"/>
     </w:pPr>
     <w:rPr>
-      <w:rFonts w:cstheme="majorBidi" w:eastAsiaTheme="majorEastAsia"/>
-      <w:color w:themeColor="text1" w:themeTint="A6" w:val="595959"/>
+      <w:rFonts w:eastAsiaTheme="majorEastAsia" w:cstheme="majorBidi"/>
+      <w:color w:val="595959" w:themeColor="text1" w:themeTint="A6"/>
     </w:rPr>
   </w:style>
-  <w:style w:styleId="Heading8" w:type="paragraph">
+  <w:style w:type="paragraph" w:styleId="Heading8">
     <w:name w:val="heading 8"/>
     <w:basedOn w:val="Normal"/>
     <w:next w:val="BodyText"/>
@@ -5117,13 +5300,13 @@
       <w:outlineLvl w:val="7"/>
     </w:pPr>
     <w:rPr>
-      <w:rFonts w:cstheme="majorBidi" w:eastAsiaTheme="majorEastAsia"/>
+      <w:rFonts w:eastAsiaTheme="majorEastAsia" w:cstheme="majorBidi"/>
       <w:i/>
       <w:iCs/>
-      <w:color w:themeColor="text1" w:themeTint="D8" w:val="272727"/>
+      <w:color w:val="272727" w:themeColor="text1" w:themeTint="D8"/>
     </w:rPr>
   </w:style>
-  <w:style w:styleId="Heading9" w:type="paragraph">
+  <w:style w:type="paragraph" w:styleId="Heading9">
     <w:name w:val="heading 9"/>
     <w:basedOn w:val="Normal"/>
     <w:next w:val="BodyText"/>
@@ -5140,24 +5323,24 @@
       <w:outlineLvl w:val="8"/>
     </w:pPr>
     <w:rPr>
-      <w:rFonts w:cstheme="majorBidi" w:eastAsiaTheme="majorEastAsia"/>
-      <w:color w:themeColor="text1" w:themeTint="D8" w:val="272727"/>
+      <w:rFonts w:eastAsiaTheme="majorEastAsia" w:cstheme="majorBidi"/>
+      <w:color w:val="272727" w:themeColor="text1" w:themeTint="D8"/>
     </w:rPr>
   </w:style>
-  <w:style w:customStyle="1" w:styleId="Heading1Char" w:type="character">
+  <w:style w:type="character" w:customStyle="1" w:styleId="Heading1Char">
     <w:name w:val="Heading 1 Char"/>
     <w:basedOn w:val="DefaultParagraphFont"/>
     <w:link w:val="Heading1"/>
     <w:uiPriority w:val="9"/>
     <w:rsid w:val="00A10FD9"/>
     <w:rPr>
-      <w:rFonts w:asciiTheme="majorHAnsi" w:cstheme="majorBidi" w:eastAsiaTheme="majorEastAsia" w:hAnsiTheme="majorHAnsi"/>
-      <w:color w:themeColor="accent1" w:themeShade="BF" w:val="0F4761"/>
+      <w:rFonts w:asciiTheme="majorHAnsi" w:eastAsiaTheme="majorEastAsia" w:hAnsiTheme="majorHAnsi" w:cstheme="majorBidi"/>
+      <w:color w:val="0F4761" w:themeColor="accent1" w:themeShade="BF"/>
       <w:sz w:val="40"/>
       <w:szCs w:val="40"/>
     </w:rPr>
   </w:style>
-  <w:style w:customStyle="1" w:styleId="Heading2Char" w:type="character">
+  <w:style w:type="character" w:customStyle="1" w:styleId="Heading2Char">
     <w:name w:val="Heading 2 Char"/>
     <w:basedOn w:val="DefaultParagraphFont"/>
     <w:link w:val="Heading2"/>
@@ -5165,13 +5348,13 @@
     <w:semiHidden/>
     <w:rsid w:val="00A10FD9"/>
     <w:rPr>
-      <w:rFonts w:asciiTheme="majorHAnsi" w:cstheme="majorBidi" w:eastAsiaTheme="majorEastAsia" w:hAnsiTheme="majorHAnsi"/>
-      <w:color w:themeColor="accent1" w:themeShade="BF" w:val="0F4761"/>
+      <w:rFonts w:asciiTheme="majorHAnsi" w:eastAsiaTheme="majorEastAsia" w:hAnsiTheme="majorHAnsi" w:cstheme="majorBidi"/>
+      <w:color w:val="0F4761" w:themeColor="accent1" w:themeShade="BF"/>
       <w:sz w:val="32"/>
       <w:szCs w:val="32"/>
     </w:rPr>
   </w:style>
-  <w:style w:customStyle="1" w:styleId="Heading3Char" w:type="character">
+  <w:style w:type="character" w:customStyle="1" w:styleId="Heading3Char">
     <w:name w:val="Heading 3 Char"/>
     <w:basedOn w:val="DefaultParagraphFont"/>
     <w:link w:val="Heading3"/>
@@ -5179,13 +5362,13 @@
     <w:semiHidden/>
     <w:rsid w:val="00A10FD9"/>
     <w:rPr>
-      <w:rFonts w:cstheme="majorBidi" w:eastAsiaTheme="majorEastAsia"/>
-      <w:color w:themeColor="accent1" w:themeShade="BF" w:val="0F4761"/>
+      <w:rFonts w:eastAsiaTheme="majorEastAsia" w:cstheme="majorBidi"/>
+      <w:color w:val="0F4761" w:themeColor="accent1" w:themeShade="BF"/>
       <w:sz w:val="28"/>
       <w:szCs w:val="28"/>
     </w:rPr>
   </w:style>
-  <w:style w:customStyle="1" w:styleId="Heading4Char" w:type="character">
+  <w:style w:type="character" w:customStyle="1" w:styleId="Heading4Char">
     <w:name w:val="Heading 4 Char"/>
     <w:basedOn w:val="DefaultParagraphFont"/>
     <w:link w:val="Heading4"/>
@@ -5193,13 +5376,13 @@
     <w:semiHidden/>
     <w:rsid w:val="00A10FD9"/>
     <w:rPr>
-      <w:rFonts w:cstheme="majorBidi" w:eastAsiaTheme="majorEastAsia"/>
+      <w:rFonts w:eastAsiaTheme="majorEastAsia" w:cstheme="majorBidi"/>
       <w:i/>
       <w:iCs/>
-      <w:color w:themeColor="accent1" w:themeShade="BF" w:val="0F4761"/>
+      <w:color w:val="0F4761" w:themeColor="accent1" w:themeShade="BF"/>
     </w:rPr>
   </w:style>
-  <w:style w:customStyle="1" w:styleId="Heading5Char" w:type="character">
+  <w:style w:type="character" w:customStyle="1" w:styleId="Heading5Char">
     <w:name w:val="Heading 5 Char"/>
     <w:basedOn w:val="DefaultParagraphFont"/>
     <w:link w:val="Heading5"/>
@@ -5207,11 +5390,11 @@
     <w:semiHidden/>
     <w:rsid w:val="00A10FD9"/>
     <w:rPr>
-      <w:rFonts w:cstheme="majorBidi" w:eastAsiaTheme="majorEastAsia"/>
-      <w:color w:themeColor="accent1" w:themeShade="BF" w:val="0F4761"/>
+      <w:rFonts w:eastAsiaTheme="majorEastAsia" w:cstheme="majorBidi"/>
+      <w:color w:val="0F4761" w:themeColor="accent1" w:themeShade="BF"/>
     </w:rPr>
   </w:style>
-  <w:style w:customStyle="1" w:styleId="Heading6Char" w:type="character">
+  <w:style w:type="character" w:customStyle="1" w:styleId="Heading6Char">
     <w:name w:val="Heading 6 Char"/>
     <w:basedOn w:val="DefaultParagraphFont"/>
     <w:link w:val="Heading6"/>
@@ -5219,13 +5402,13 @@
     <w:semiHidden/>
     <w:rsid w:val="00A10FD9"/>
     <w:rPr>
-      <w:rFonts w:cstheme="majorBidi" w:eastAsiaTheme="majorEastAsia"/>
+      <w:rFonts w:eastAsiaTheme="majorEastAsia" w:cstheme="majorBidi"/>
       <w:i/>
       <w:iCs/>
-      <w:color w:themeColor="text1" w:themeTint="A6" w:val="595959"/>
+      <w:color w:val="595959" w:themeColor="text1" w:themeTint="A6"/>
     </w:rPr>
   </w:style>
-  <w:style w:customStyle="1" w:styleId="Heading7Char" w:type="character">
+  <w:style w:type="character" w:customStyle="1" w:styleId="Heading7Char">
     <w:name w:val="Heading 7 Char"/>
     <w:basedOn w:val="DefaultParagraphFont"/>
     <w:link w:val="Heading7"/>
@@ -5233,11 +5416,11 @@
     <w:semiHidden/>
     <w:rsid w:val="00A10FD9"/>
     <w:rPr>
-      <w:rFonts w:cstheme="majorBidi" w:eastAsiaTheme="majorEastAsia"/>
-      <w:color w:themeColor="text1" w:themeTint="A6" w:val="595959"/>
+      <w:rFonts w:eastAsiaTheme="majorEastAsia" w:cstheme="majorBidi"/>
+      <w:color w:val="595959" w:themeColor="text1" w:themeTint="A6"/>
     </w:rPr>
   </w:style>
-  <w:style w:customStyle="1" w:styleId="Heading8Char" w:type="character">
+  <w:style w:type="character" w:customStyle="1" w:styleId="Heading8Char">
     <w:name w:val="Heading 8 Char"/>
     <w:basedOn w:val="DefaultParagraphFont"/>
     <w:link w:val="Heading8"/>
@@ -5245,13 +5428,13 @@
     <w:semiHidden/>
     <w:rsid w:val="00A10FD9"/>
     <w:rPr>
-      <w:rFonts w:cstheme="majorBidi" w:eastAsiaTheme="majorEastAsia"/>
+      <w:rFonts w:eastAsiaTheme="majorEastAsia" w:cstheme="majorBidi"/>
       <w:i/>
       <w:iCs/>
-      <w:color w:themeColor="text1" w:themeTint="D8" w:val="272727"/>
+      <w:color w:val="272727" w:themeColor="text1" w:themeTint="D8"/>
     </w:rPr>
   </w:style>
-  <w:style w:customStyle="1" w:styleId="Heading9Char" w:type="character">
+  <w:style w:type="character" w:customStyle="1" w:styleId="Heading9Char">
     <w:name w:val="Heading 9 Char"/>
     <w:basedOn w:val="DefaultParagraphFont"/>
     <w:link w:val="Heading9"/>
@@ -5259,35 +5442,11 @@
     <w:semiHidden/>
     <w:rsid w:val="00A10FD9"/>
     <w:rPr>
-      <w:rFonts w:cstheme="majorBidi" w:eastAsiaTheme="majorEastAsia"/>
-      <w:color w:themeColor="text1" w:themeTint="D8" w:val="272727"/>
+      <w:rFonts w:eastAsiaTheme="majorEastAsia" w:cstheme="majorBidi"/>
+      <w:color w:val="272727" w:themeColor="text1" w:themeTint="D8"/>
     </w:rPr>
   </w:style>
-  <w:style w:styleId="BlockText" w:type="paragraph">
-    <w:name w:val="Block Text"/>
-    <w:basedOn w:val="Normal"/>
-    <w:next w:val="BodyText"/>
-    <w:qFormat/>
-    <w:pPr>
-      <w:spacing w:after="140" w:before="140" w:line="240" w:lineRule="auto"/>
-      <w:ind w:firstLine="0" w:left="720" w:right="720"/>
-    </w:pPr>
-  </w:style>
-  <w:style w:styleId="FootnoteText" w:type="paragraph">
-    <w:name w:val="footnote text"/>
-    <w:basedOn w:val="Normal"/>
-    <w:uiPriority w:val="99"/>
-    <w:unhideWhenUsed/>
-    <w:pPr>
-      <w:spacing w:after="80" w:before="0" w:line="240" w:lineRule="auto"/>
-      <w:ind w:firstLine="0"/>
-    </w:pPr>
-    <w:rPr>
-      <w:sz w:val="28"/>
-      <w:szCs w:val="28"/>
-    </w:rPr>
-  </w:style>
-  <w:style w:styleId="FootnoteBlockText" w:type="paragraph">
+  <w:style w:type="paragraph" w:styleId="FootnoteBlockText">
     <w:name w:val="Footnote Block Text"/>
     <w:basedOn w:val="FootnoteText"/>
     <w:next w:val="FootnoteText"/>
@@ -5295,38 +5454,29 @@
     <w:unhideWhenUsed/>
     <w:qFormat/>
     <w:pPr>
-      <w:spacing w:after="100" w:before="100"/>
+      <w:spacing w:before="100" w:after="100"/>
       <w:ind w:firstLine="0" w:left="480" w:right="480"/>
     </w:pPr>
   </w:style>
-  <w:style w:default="1" w:styleId="DefaultParagraphFont" w:type="character">
+  <w:style w:type="character" w:default="1" w:styleId="DefaultParagraphFont">
     <w:name w:val="Default Paragraph Font"/>
     <w:semiHidden/>
     <w:unhideWhenUsed/>
   </w:style>
-  <w:style w:default="1" w:styleId="Table" w:type="table">
+  <w:style w:type="table" w:default="1" w:styleId="Table">
     <w:name w:val="Table"/>
     <w:basedOn w:val="TableNormal"/>
-    <w:semiHidden/>
-    <w:unhideWhenUsed/>
     <w:qFormat/>
     <w:tblPr>
-      <w:tblInd w:type="dxa" w:w="0"/>
+      <w:tblInd w:w="0" w:type="dxa"/>
       <w:tblCellMar>
-        <w:top w:type="dxa" w:w="0"/>
-        <w:left w:type="dxa" w:w="108"/>
-        <w:bottom w:type="dxa" w:w="0"/>
-        <w:right w:type="dxa" w:w="108"/>
+        <w:top w:w="0" w:type="dxa"/>
+        <w:left w:w="108" w:type="dxa"/>
+        <w:bottom w:w="0" w:type="dxa"/>
+        <w:right w:w="108" w:type="dxa"/>
       </w:tblCellMar>
     </w:tblPr>
     <w:tblStylePr w:type="firstRow">
-      <w:tblPr>
-        <w:jc w:val="left"/>
-        <w:tblInd w:type="dxa" w:w="0"/>
-      </w:tblPr>
-      <w:trPr>
-        <w:jc w:val="left"/>
-      </w:trPr>
       <w:tcPr>
         <w:tcBorders>
           <w:bottom w:val="single"/>
@@ -5335,7 +5485,7 @@
       </w:tcPr>
     </w:tblStylePr>
   </w:style>
-  <w:style w:customStyle="1" w:styleId="DefinitionTerm" w:type="paragraph">
+  <w:style w:type="paragraph" w:customStyle="1" w:styleId="DefinitionTerm">
     <w:name w:val="Definition Term"/>
     <w:basedOn w:val="Normal"/>
     <w:next w:val="Definition"/>
@@ -5348,49 +5498,49 @@
       <w:b/>
     </w:rPr>
   </w:style>
-  <w:style w:customStyle="1" w:styleId="Definition" w:type="paragraph">
+  <w:style w:type="paragraph" w:customStyle="1" w:styleId="Definition">
     <w:name w:val="Definition"/>
     <w:basedOn w:val="Normal"/>
   </w:style>
-  <w:style w:styleId="Caption" w:type="paragraph">
+  <w:style w:type="paragraph" w:styleId="Caption">
     <w:name w:val="Caption"/>
     <w:basedOn w:val="Normal"/>
     <w:link w:val="BodyTextChar"/>
     <w:pPr>
-      <w:spacing w:after="120" w:before="0"/>
+      <w:spacing w:before="0" w:after="120"/>
     </w:pPr>
     <w:rPr>
       <w:i/>
     </w:rPr>
   </w:style>
-  <w:style w:customStyle="1" w:styleId="TableCaption" w:type="paragraph">
+  <w:style w:type="paragraph" w:customStyle="1" w:styleId="TableCaption">
     <w:name w:val="Table Caption"/>
     <w:basedOn w:val="Caption"/>
     <w:pPr>
       <w:keepNext/>
     </w:pPr>
   </w:style>
-  <w:style w:customStyle="1" w:styleId="ImageCaption" w:type="paragraph">
+  <w:style w:type="paragraph" w:customStyle="1" w:styleId="ImageCaption">
     <w:name w:val="Image Caption"/>
     <w:basedOn w:val="Caption"/>
   </w:style>
-  <w:style w:customStyle="1" w:styleId="Figure" w:type="paragraph">
+  <w:style w:type="paragraph" w:customStyle="1" w:styleId="Figure">
     <w:name w:val="Figure"/>
     <w:basedOn w:val="Normal"/>
   </w:style>
-  <w:style w:customStyle="1" w:styleId="CaptionedFigure" w:type="paragraph">
+  <w:style w:type="paragraph" w:customStyle="1" w:styleId="CaptionedFigure">
     <w:name w:val="Captioned Figure"/>
     <w:basedOn w:val="Figure"/>
     <w:pPr>
       <w:keepNext/>
     </w:pPr>
   </w:style>
-  <w:style w:customStyle="1" w:styleId="BodyTextChar" w:type="character">
+  <w:style w:type="character" w:customStyle="1" w:styleId="BodyTextChar">
     <w:name w:val="Body Text Char"/>
     <w:basedOn w:val="DefaultParagraphFont"/>
     <w:link w:val="BodyText"/>
   </w:style>
-  <w:style w:customStyle="1" w:styleId="VerbatimChar" w:type="character">
+  <w:style w:type="character" w:customStyle="1" w:styleId="VerbatimChar">
     <w:name w:val="Verbatim Char"/>
     <w:basedOn w:val="BodyTextChar"/>
     <w:rPr>
@@ -5398,25 +5548,25 @@
       <w:sz w:val="22"/>
     </w:rPr>
   </w:style>
-  <w:style w:customStyle="1" w:styleId="SectionNumber" w:type="character">
+  <w:style w:type="character" w:customStyle="1" w:styleId="SectionNumber">
     <w:name w:val="Section Number"/>
     <w:basedOn w:val="BodyTextChar"/>
   </w:style>
-  <w:style w:styleId="FootnoteReference" w:type="character">
+  <w:style w:type="character" w:styleId="FootnoteReference">
     <w:name w:val="Footnote Reference"/>
     <w:basedOn w:val="BodyTextChar"/>
     <w:rPr>
       <w:vertAlign w:val="superscript"/>
     </w:rPr>
   </w:style>
-  <w:style w:styleId="Hyperlink" w:type="character">
+  <w:style w:type="character" w:styleId="Hyperlink">
     <w:name w:val="Hyperlink"/>
     <w:basedOn w:val="BodyTextChar"/>
     <w:rPr>
-      <w:color w:themeColor="accent1" w:val="4F81BD"/>
+      <w:color w:val="4F81BD" w:themeColor="accent1"/>
     </w:rPr>
   </w:style>
-  <w:style w:styleId="TOCHeading" w:type="paragraph">
+  <w:style w:type="paragraph" w:styleId="TOCHeading">
     <w:name w:val="TOC Heading"/>
     <w:basedOn w:val="Heading1"/>
     <w:next w:val="BodyText"/>
@@ -5428,22 +5578,190 @@
       <w:outlineLvl w:val="9"/>
     </w:pPr>
     <w:rPr>
-      <w:rFonts w:asciiTheme="majorHAnsi" w:cstheme="majorBidi" w:eastAsiaTheme="majorEastAsia" w:hAnsiTheme="majorHAnsi"/>
+      <w:rFonts w:asciiTheme="majorHAnsi" w:eastAsiaTheme="majorEastAsia" w:hAnsiTheme="majorHAnsi" w:cstheme="majorBidi"/>
       <w:b w:val="0"/>
       <w:bCs w:val="0"/>
-      <w:color w:themeColor="accent1" w:themeShade="BF" w:val="365F91"/>
+      <w:color w:val="365F91" w:themeColor="accent1" w:themeShade="BF"/>
     </w:rPr>
   </w:style>
-  <w:style w:customStyle="1" w:styleId="Single" w:type="paragraph">
+  <w:style w:type="paragraph" w:default="1" w:styleId="Normal">
+    <w:name w:val="Normal"/>
+    <w:qFormat/>
+    <w:pPr>
+      <w:widowControl/>
+      <w:spacing w:before="0" w:after="0" w:line="240" w:lineRule="auto"/>
+      <w:ind w:firstLine="0"/>
+    </w:pPr>
+    <w:rPr>
+      <w:rFonts w:ascii="Times New Roman" w:hAnsi="Times New Roman" w:eastAsia="Times New Roman" w:cs="Times New Roman"/>
+      <w:color w:val="000000"/>
+      <w:sz w:val="28"/>
+      <w:szCs w:val="28"/>
+    </w:rPr>
+  </w:style>
+  <w:style w:type="paragraph" w:styleId="BodyText">
+    <w:name w:val="Body Text"/>
+    <w:basedOn w:val="Normal"/>
+    <w:qFormat/>
+    <w:pPr>
+      <w:spacing w:before="0" w:after="0" w:line="566" w:lineRule="exact"/>
+      <w:ind w:firstLine="720"/>
+    </w:pPr>
+  </w:style>
+  <w:style w:type="paragraph" w:styleId="FirstParagraph">
+    <w:name w:val="First Paragraph"/>
+    <w:basedOn w:val="BodyText"/>
+    <w:next w:val="BodyText"/>
+    <w:qFormat/>
+    <w:pPr>
+      <w:spacing w:before="0" w:after="0" w:line="566" w:lineRule="exact"/>
+      <w:ind w:firstLine="720"/>
+    </w:pPr>
+  </w:style>
+  <w:style w:type="paragraph" w:styleId="Compact">
+    <w:name w:val="Compact"/>
+    <w:basedOn w:val="BodyText"/>
+    <w:qFormat/>
+    <w:pPr>
+      <w:spacing w:before="0" w:after="0" w:line="566" w:lineRule="exact"/>
+      <w:ind w:firstLine="0"/>
+    </w:pPr>
+  </w:style>
+  <w:style w:type="paragraph" w:styleId="Heading1">
+    <w:name w:val="heading 1"/>
+    <w:basedOn w:val="Normal"/>
+    <w:next w:val="BodyText"/>
+    <w:uiPriority w:val="9"/>
+    <w:qFormat/>
+    <w:pPr>
+      <w:keepNext/>
+      <w:keepLines/>
+      <w:spacing w:before="283" w:after="283" w:line="566" w:lineRule="exact"/>
+      <w:ind w:firstLine="0"/>
+      <w:jc w:val="center"/>
+      <w:outlineLvl w:val="0"/>
+    </w:pPr>
+    <w:rPr>
+      <w:b/>
+      <w:bCs/>
+      <w:caps/>
+      <w:color w:val="000000"/>
+      <w:sz w:val="28"/>
+      <w:szCs w:val="28"/>
+    </w:rPr>
+  </w:style>
+  <w:style w:type="paragraph" w:styleId="Heading2">
+    <w:name w:val="heading 2"/>
+    <w:basedOn w:val="Normal"/>
+    <w:next w:val="BodyText"/>
+    <w:uiPriority w:val="9"/>
+    <w:unhideWhenUsed/>
+    <w:qFormat/>
+    <w:pPr>
+      <w:keepNext/>
+      <w:keepLines/>
+      <w:tabs>
+        <w:tab w:val="left" w:pos="720"/>
+      </w:tabs>
+      <w:spacing w:before="283" w:after="283" w:line="566" w:lineRule="exact"/>
+      <w:ind w:left="720" w:hanging="720" w:firstLine="0"/>
+      <w:jc w:val="left"/>
+      <w:outlineLvl w:val="1"/>
+    </w:pPr>
+    <w:rPr>
+      <w:b/>
+      <w:bCs/>
+      <w:color w:val="000000"/>
+      <w:sz w:val="28"/>
+      <w:szCs w:val="28"/>
+    </w:rPr>
+  </w:style>
+  <w:style w:type="paragraph" w:styleId="Heading3">
+    <w:name w:val="heading 3"/>
+    <w:basedOn w:val="Normal"/>
+    <w:next w:val="BodyText"/>
+    <w:uiPriority w:val="9"/>
+    <w:unhideWhenUsed/>
+    <w:qFormat/>
+    <w:pPr>
+      <w:keepNext/>
+      <w:keepLines/>
+      <w:tabs>
+        <w:tab w:val="left" w:pos="1440"/>
+      </w:tabs>
+      <w:spacing w:before="283" w:after="283" w:line="566" w:lineRule="exact"/>
+      <w:ind w:left="1440" w:hanging="720" w:firstLine="0"/>
+      <w:jc w:val="left"/>
+      <w:outlineLvl w:val="2"/>
+    </w:pPr>
+    <w:rPr>
+      <w:b/>
+      <w:bCs/>
+      <w:color w:val="000000"/>
+      <w:sz w:val="28"/>
+      <w:szCs w:val="28"/>
+    </w:rPr>
+  </w:style>
+  <w:style w:type="paragraph" w:styleId="Heading4">
+    <w:name w:val="heading 4"/>
+    <w:basedOn w:val="Normal"/>
+    <w:next w:val="BodyText"/>
+    <w:uiPriority w:val="9"/>
+    <w:unhideWhenUsed/>
+    <w:qFormat/>
+    <w:pPr>
+      <w:keepNext/>
+      <w:keepLines/>
+      <w:tabs>
+        <w:tab w:val="left" w:pos="2160"/>
+      </w:tabs>
+      <w:spacing w:before="283" w:after="283" w:line="566" w:lineRule="exact"/>
+      <w:ind w:left="2160" w:hanging="720" w:firstLine="0"/>
+      <w:jc w:val="left"/>
+      <w:outlineLvl w:val="3"/>
+    </w:pPr>
+    <w:rPr>
+      <w:b/>
+      <w:bCs/>
+      <w:color w:val="000000"/>
+      <w:sz w:val="28"/>
+      <w:szCs w:val="28"/>
+    </w:rPr>
+  </w:style>
+  <w:style w:type="paragraph" w:styleId="BlockText">
+    <w:name w:val="Block Text"/>
+    <w:basedOn w:val="Normal"/>
+    <w:next w:val="BodyText"/>
+    <w:qFormat/>
+    <w:pPr>
+      <w:spacing w:before="140" w:after="140" w:line="240" w:lineRule="auto"/>
+      <w:ind w:left="720" w:right="720" w:firstLine="0"/>
+    </w:pPr>
+  </w:style>
+  <w:style w:type="paragraph" w:styleId="FootnoteText">
+    <w:name w:val="footnote text"/>
+    <w:basedOn w:val="Normal"/>
+    <w:uiPriority w:val="99"/>
+    <w:unhideWhenUsed/>
+    <w:pPr>
+      <w:spacing w:before="0" w:after="80" w:line="240" w:lineRule="auto"/>
+      <w:ind w:firstLine="0"/>
+    </w:pPr>
+    <w:rPr>
+      <w:sz w:val="28"/>
+      <w:szCs w:val="28"/>
+    </w:rPr>
+  </w:style>
+  <w:style w:type="paragraph" w:customStyle="1" w:styleId="Single">
     <w:name w:val="Single"/>
     <w:basedOn w:val="Normal"/>
     <w:qFormat/>
     <w:pPr>
-      <w:spacing w:after="0" w:before="0" w:line="240" w:lineRule="auto"/>
+      <w:spacing w:before="0" w:after="0" w:line="240" w:lineRule="auto"/>
       <w:ind w:firstLine="0"/>
     </w:pPr>
   </w:style>
-  <w:style w:customStyle="1" w:styleId="Centered" w:type="paragraph">
+  <w:style w:type="paragraph" w:customStyle="1" w:styleId="Centered">
     <w:name w:val="Centered"/>
     <w:basedOn w:val="Single"/>
     <w:qFormat/>
@@ -5451,23 +5769,39 @@
       <w:jc w:val="center"/>
     </w:pPr>
   </w:style>
-  <w:style w:customStyle="1" w:styleId="Gap" w:type="paragraph">
+  <w:style w:type="paragraph" w:customStyle="1" w:styleId="Gap">
     <w:name w:val="Gap"/>
     <w:basedOn w:val="Normal"/>
     <w:pPr>
-      <w:spacing w:after="0" w:before="0" w:line="566" w:lineRule="exact"/>
+      <w:spacing w:before="0" w:after="0" w:line="566" w:lineRule="exact"/>
       <w:ind w:firstLine="0"/>
     </w:pPr>
   </w:style>
-  <w:style w:customStyle="1" w:styleId="Half" w:type="paragraph">
+  <w:style w:type="paragraph" w:customStyle="1" w:styleId="Half">
     <w:name w:val="Half"/>
     <w:basedOn w:val="Normal"/>
     <w:pPr>
-      <w:spacing w:after="0" w:before="0" w:line="283" w:lineRule="exact"/>
+      <w:spacing w:before="0" w:after="0" w:line="283" w:lineRule="exact"/>
       <w:ind w:firstLine="0"/>
     </w:pPr>
   </w:style>
-  <w:style w:customStyle="1" w:styleId="UnlistedHeading" w:type="paragraph">
+  <w:style w:type="paragraph" w:customStyle="1" w:styleId="Designation">
+    <w:name w:val="Designation"/>
+    <w:basedOn w:val="Single"/>
+    <w:qFormat/>
+    <w:pPr>
+      <w:jc w:val="right"/>
+    </w:pPr>
+  </w:style>
+  <w:style w:type="paragraph" w:customStyle="1" w:styleId="BodyKeep">
+    <w:name w:val="Body Keep"/>
+    <w:basedOn w:val="BodyText"/>
+    <w:qFormat/>
+    <w:pPr>
+      <w:keepNext/>
+    </w:pPr>
+  </w:style>
+  <w:style w:type="paragraph" w:customStyle="1" w:styleId="UnlistedHeading">
     <w:name w:val="Unlisted Heading"/>
     <w:basedOn w:val="Normal"/>
     <w:next w:val="BodyText"/>
@@ -5475,7 +5809,7 @@
     <w:pPr>
       <w:keepNext/>
       <w:keepLines/>
-      <w:spacing w:after="283" w:before="283" w:line="566" w:lineRule="exact"/>
+      <w:spacing w:before="283" w:after="283" w:line="566" w:lineRule="exact"/>
       <w:ind w:firstLine="0"/>
       <w:jc w:val="center"/>
     </w:pPr>
@@ -5487,7 +5821,7 @@
       <w:szCs w:val="28"/>
     </w:rPr>
   </w:style>
-  <w:style w:customStyle="1" w:styleId="UnlistedHeadingNewPage" w:type="paragraph">
+  <w:style w:type="paragraph" w:customStyle="1" w:styleId="UnlistedHeadingNewPage">
     <w:name w:val="Unlisted Heading New Page"/>
     <w:basedOn w:val="UnlistedHeading"/>
     <w:next w:val="BodyText"/>
@@ -5496,22 +5830,26 @@
       <w:pageBreakBefore/>
     </w:pPr>
   </w:style>
-  <w:style w:customStyle="1" w:styleId="TOCEntry" w:type="paragraph">
+  <w:style w:type="paragraph" w:customStyle="1" w:styleId="TOCEntry">
     <w:name w:val="TOC Entry"/>
     <w:basedOn w:val="Single"/>
     <w:qFormat/>
     <w:pPr>
-      <w:spacing w:after="200" w:before="0" w:line="240" w:lineRule="auto"/>
-      <w:ind w:firstLine="0"/>
+      <w:keepLines/>
+      <w:tabs>
+        <w:tab w:val="right" w:leader="dot" w:pos="9340"/>
+      </w:tabs>
+      <w:spacing w:before="0" w:after="200" w:line="240" w:lineRule="auto"/>
+      <w:ind w:left="720" w:right="720" w:hanging="720"/>
     </w:pPr>
   </w:style>
-  <w:style w:customStyle="1" w:styleId="TOAGroup" w:type="paragraph">
+  <w:style w:type="paragraph" w:customStyle="1" w:styleId="TOAGroup">
     <w:name w:val="TOA Group"/>
     <w:basedOn w:val="Single"/>
     <w:qFormat/>
     <w:pPr>
       <w:keepNext/>
-      <w:spacing w:after="200" w:before="283" w:line="240" w:lineRule="auto"/>
+      <w:spacing w:before="283" w:after="200" w:line="240" w:lineRule="auto"/>
       <w:ind w:firstLine="0"/>
     </w:pPr>
     <w:rPr>
@@ -5519,22 +5857,26 @@
       <w:bCs/>
     </w:rPr>
   </w:style>
-  <w:style w:customStyle="1" w:styleId="TOAEntry" w:type="paragraph">
+  <w:style w:type="paragraph" w:customStyle="1" w:styleId="TOAEntry">
     <w:name w:val="TOA Entry"/>
     <w:basedOn w:val="Single"/>
     <w:qFormat/>
     <w:pPr>
-      <w:spacing w:after="200" w:before="0" w:line="240" w:lineRule="auto"/>
-      <w:ind w:firstLine="0" w:hanging="720" w:left="720"/>
+      <w:keepLines/>
+      <w:tabs>
+        <w:tab w:val="right" w:leader="dot" w:pos="9340"/>
+      </w:tabs>
+      <w:spacing w:before="0" w:after="200" w:line="240" w:lineRule="auto"/>
+      <w:ind w:left="720" w:right="1120" w:hanging="720"/>
     </w:pPr>
   </w:style>
-  <w:style w:styleId="Footer" w:type="paragraph">
+  <w:style w:type="paragraph" w:styleId="Footer">
     <w:name w:val="footer"/>
     <w:basedOn w:val="Normal"/>
     <w:uiPriority w:val="99"/>
     <w:unhideWhenUsed/>
     <w:pPr>
-      <w:spacing w:after="0" w:before="0" w:line="240" w:lineRule="auto"/>
+      <w:spacing w:before="0" w:after="0" w:line="240" w:lineRule="auto"/>
       <w:ind w:firstLine="0"/>
       <w:jc w:val="center"/>
     </w:pPr>
@@ -5542,6 +5884,11 @@
       <w:sz w:val="24"/>
       <w:szCs w:val="24"/>
     </w:rPr>
+  </w:style>
+  <w:style w:type="paragraph" w:customStyle="1" w:styleId="BodyKeep">
+    <w:name w:val="BodyKeep"/>
+    <w:basedOn w:val="BodyText"/>
+    <w:qFormat/>
   </w:style>
   <w:style w:type="paragraph" w:customStyle="1" w:styleId="SourceCode">
     <w:name w:val="Source Code"/>
@@ -5823,7 +6170,7 @@
     </a:clrScheme>
     <a:fontScheme name="Office">
       <a:majorFont>
-        <a:latin typeface="Aptos Display" panose="02110004020202020204"/>
+        <a:latin typeface="Times New Roman" panose="02110004020202020204"/>
         <a:ea typeface=""/>
         <a:cs typeface=""/>
         <a:font script="Jpan" typeface="游ゴシック Light"/>
@@ -5875,7 +6222,7 @@
         <a:font script="Tfng" typeface="Ebrima"/>
       </a:majorFont>
       <a:minorFont>
-        <a:latin typeface="Aptos" panose="02110004020202020204"/>
+        <a:latin typeface="Times New Roman" panose="02110004020202020204"/>
         <a:ea typeface=""/>
         <a:cs typeface=""/>
         <a:font script="Jpan" typeface="游明朝"/>

</xml_diff>